<commit_message>
Update brand skill and Sunday hours details, add 9/13 vendor sign-in sheet, board games poster, 17 new photos
Co-Authored-By: Claude Opus 5 <noreply@anthropic.com>
</commit_message>
<xml_diff>
--- a/vendor-market/vendor_sign_in_sheet.docx
+++ b/vendor-market/vendor_sign_in_sheet.docx
@@ -61,7 +61,7 @@
                 <w:sz w:val="19"/>
                 <w:szCs w:val="19"/>
               </w:rPr>
-              <w:t>Backyard Brew is not responsible for weather-related cancellations, or for any damage to or theft of vendor property during the event. In the event of bad weather, it's up to each vendor to decide whether to stay and wait out the storm or leave. By checking in on 8/23, you're acknowledging these terms and the risks involved.</w:t>
+              <w:t>Backyard Brew is not responsible for weather-related cancellations, or for any damage to or theft of vendor property during the event. In the event of bad weather, it's up to each vendor to decide whether to stay and wait out the storm or leave. By checking in on 9/13, you're acknowledging these terms and the risks involved.</w:t>
             </w:r>
           </w:p>
         </w:tc>
@@ -255,7 +255,7 @@
           </w:tcPr>
           <w:p>
             <w:r>
-              <w:t>Jill Ziesemer</w:t>
+              <w:t>Faith Maryann</w:t>
             </w:r>
           </w:p>
         </w:tc>
@@ -272,7 +272,7 @@
           </w:tcPr>
           <w:p>
             <w:r>
-              <w:t>Dear Soul Handmade</w:t>
+              <w:t>Faith’s Sourdough and Baked Goods</w:t>
             </w:r>
           </w:p>
         </w:tc>
@@ -345,7 +345,7 @@
           </w:tcPr>
           <w:p>
             <w:r>
-              <w:t>Emma Stamm</w:t>
+              <w:t>Lori Molina Stromberg</w:t>
             </w:r>
           </w:p>
         </w:tc>
@@ -363,7 +363,7 @@
           </w:tcPr>
           <w:p>
             <w:r>
-              <w:t>Icing &amp; Ink Desserts</w:t>
+              <w:t>Custom Painted Signs by Lori</w:t>
             </w:r>
           </w:p>
         </w:tc>
@@ -438,7 +438,7 @@
           </w:tcPr>
           <w:p>
             <w:r>
-              <w:t>Chris Dewolfe</w:t>
+              <w:t>Brenda Crump</w:t>
             </w:r>
           </w:p>
         </w:tc>
@@ -455,7 +455,7 @@
           </w:tcPr>
           <w:p>
             <w:r>
-              <w:t>Quackers Honey Farm</w:t>
+              <w:t>CuznBrenBrenSeasoning</w:t>
             </w:r>
           </w:p>
         </w:tc>
@@ -528,7 +528,7 @@
           </w:tcPr>
           <w:p>
             <w:r>
-              <w:t>Olivia Jeanne Flora</w:t>
+              <w:t>Kathy Deau Holzer</w:t>
             </w:r>
           </w:p>
         </w:tc>
@@ -546,7 +546,7 @@
           </w:tcPr>
           <w:p>
             <w:r>
-              <w:t>Livvie-Linx Jewelry</w:t>
+              <w:t>Velvet Antler</w:t>
             </w:r>
           </w:p>
         </w:tc>
@@ -621,7 +621,7 @@
           </w:tcPr>
           <w:p>
             <w:r>
-              <w:t>Brittany Smith</w:t>
+              <w:t>Morgan Saracena</w:t>
             </w:r>
           </w:p>
         </w:tc>
@@ -637,9 +637,7 @@
             <w:vAlign w:val="center"/>
           </w:tcPr>
           <w:p>
-            <w:r>
-              <w:t>Grace Mae Boutique</w:t>
-            </w:r>
+            <w:r/>
           </w:p>
         </w:tc>
         <w:tc>
@@ -711,7 +709,7 @@
           </w:tcPr>
           <w:p>
             <w:r>
-              <w:t>Blacksmith</w:t>
+              <w:t>Jaydah Truran</w:t>
             </w:r>
           </w:p>
         </w:tc>
@@ -729,7 +727,7 @@
           </w:tcPr>
           <w:p>
             <w:r>
-              <w:t>Blacksmithing</w:t>
+              <w:t>Rebel Ink</w:t>
             </w:r>
           </w:p>
         </w:tc>
@@ -804,7 +802,7 @@
           </w:tcPr>
           <w:p>
             <w:r>
-              <w:t>Jaydah Truran</w:t>
+              <w:t>Blessed Beginnings Boutique</w:t>
             </w:r>
           </w:p>
         </w:tc>
@@ -821,7 +819,7 @@
           </w:tcPr>
           <w:p>
             <w:r>
-              <w:t>Rebel Ink</w:t>
+              <w:t>Blessed Beginnings Boutique</w:t>
             </w:r>
           </w:p>
         </w:tc>
@@ -894,7 +892,7 @@
           </w:tcPr>
           <w:p>
             <w:r>
-              <w:t>Michelle Jolynn</w:t>
+              <w:t>Macy Bluml</w:t>
             </w:r>
           </w:p>
         </w:tc>
@@ -912,7 +910,7 @@
           </w:tcPr>
           <w:p>
             <w:r>
-              <w:t>Michelle Prestine Podgin’ Parties and Mod Podge items</w:t>
+              <w:t>Foundation Chiropractic</w:t>
             </w:r>
           </w:p>
         </w:tc>
@@ -987,7 +985,7 @@
           </w:tcPr>
           <w:p>
             <w:r>
-              <w:t>Alicia Meltesen</w:t>
+              <w:t>Melanie Bates</w:t>
             </w:r>
           </w:p>
         </w:tc>
@@ -1004,7 +1002,7 @@
           </w:tcPr>
           <w:p>
             <w:r>
-              <w:t>A&amp;B Creations</w:t>
+              <w:t>Frazzled Sisters</w:t>
             </w:r>
           </w:p>
         </w:tc>
@@ -1077,7 +1075,7 @@
           </w:tcPr>
           <w:p>
             <w:r>
-              <w:t>Grace Grulkowski</w:t>
+              <w:t>Mely Arevir</w:t>
             </w:r>
           </w:p>
         </w:tc>
@@ -1095,7 +1093,7 @@
           </w:tcPr>
           <w:p>
             <w:r>
-              <w:t>Graceful Gluttony</w:t>
+              <w:t>RR Boutique</w:t>
             </w:r>
           </w:p>
         </w:tc>
@@ -1170,7 +1168,7 @@
           </w:tcPr>
           <w:p>
             <w:r>
-              <w:t>Alex Brooks</w:t>
+              <w:t>Mariah Erica Payne</w:t>
             </w:r>
           </w:p>
         </w:tc>
@@ -1187,7 +1185,7 @@
           </w:tcPr>
           <w:p>
             <w:r>
-              <w:t>Photography</w:t>
+              <w:t>Luxe Co</w:t>
             </w:r>
           </w:p>
         </w:tc>
@@ -1259,7 +1257,9 @@
             <w:vAlign w:val="center"/>
           </w:tcPr>
           <w:p>
-            <w:r/>
+            <w:r>
+              <w:t>Sarah Swetnon</w:t>
+            </w:r>
           </w:p>
         </w:tc>
         <w:tc>
@@ -1275,7 +1275,9 @@
             <w:vAlign w:val="center"/>
           </w:tcPr>
           <w:p>
-            <w:r/>
+            <w:r>
+              <w:t>Bareskinstudio</w:t>
+            </w:r>
           </w:p>
         </w:tc>
         <w:tc>
@@ -1348,7 +1350,9 @@
             <w:vAlign w:val="center"/>
           </w:tcPr>
           <w:p>
-            <w:r/>
+            <w:r>
+              <w:t>Katrina Elizabeth</w:t>
+            </w:r>
           </w:p>
         </w:tc>
         <w:tc>
@@ -1363,7 +1367,9 @@
             <w:vAlign w:val="center"/>
           </w:tcPr>
           <w:p>
-            <w:r/>
+            <w:r>
+              <w:t>Scenthound Green Bay West</w:t>
+            </w:r>
           </w:p>
         </w:tc>
         <w:tc>
@@ -1434,7 +1440,9 @@
             <w:vAlign w:val="center"/>
           </w:tcPr>
           <w:p>
-            <w:r/>
+            <w:r>
+              <w:t>Cathy Dodson</w:t>
+            </w:r>
           </w:p>
         </w:tc>
         <w:tc>
@@ -1450,7 +1458,9 @@
             <w:vAlign w:val="center"/>
           </w:tcPr>
           <w:p>
-            <w:r/>
+            <w:r>
+              <w:t>Bows by Cathy</w:t>
+            </w:r>
           </w:p>
         </w:tc>
         <w:tc>

</xml_diff>